<commit_message>
docs(report): add secret environments section to the report
Covers the integration, the per-environment best scores found, and the
Secret Env 3 crash and Secret Env 2 coverage limitations, right after
the hyperparameter study; later sections renumbered accordingly.
</commit_message>
<xml_diff>
--- a/report/rapport.docx
+++ b/report/rapport.docx
@@ -3098,7 +3098,281 @@
         <w:pStyle w:val="Heading1"/>
       </w:pPr>
       <w:r>
-        <w:t>7. Quel algorithme choisir, et pourquoi</w:t>
+        <w:t>7. Intégration et résultats sur les environnements secrets</w:t>
+      </w:r>
+    </w:p>
+    <w:p>
+      <w:r>
+        <w:t>Les environnements secrets (0 à 3) sont fournis par le cours sous forme de bibliothèque compilée et d'un wrapper Python (secret_envs/), déjà disponibles avant même la fin du cours : seule l'interface graphique manque encore. Une classe adaptatrice les rend compatibles avec l'interface commune du projet, ce qui les rend utilisables par tous les algorithmes model-free (Sarsa, Q-Learning, Dyna-Q, Monte Carlo on-policy/off-policy) sans écrire de code spécifique à chacun.</w:t>
+      </w:r>
+    </w:p>
+    <w:p>
+      <w:r>
+        <w:t>Deux limites assumées : ces environnements n'exposent pas de moyen de se replacer directement dans un état donné, donc Monte Carlo ES ne s'y applique pas. Leurs espaces d'états (de 8192 à plus de 2 millions d'états) rendent aussi la programmation dynamique impraticable avec l'implémentation du projet, qui énumère explicitement toutes les combinaisons (état, action, état suivant, récompense) à chaque passage.</w:t>
+      </w:r>
+    </w:p>
+    <w:tbl>
+      <w:tblPr>
+        <w:tblStyle w:val="LightGrid-Accent1"/>
+        <w:tblW w:type="auto" w:w="0"/>
+        <w:tblLook w:firstColumn="1" w:firstRow="1" w:lastColumn="0" w:lastRow="0" w:noHBand="0" w:noVBand="1" w:val="04A0"/>
+      </w:tblPr>
+      <w:tblGrid>
+        <w:gridCol w:w="2880"/>
+        <w:gridCol w:w="2880"/>
+        <w:gridCol w:w="2880"/>
+      </w:tblGrid>
+      <w:tr>
+        <w:tc>
+          <w:tcPr>
+            <w:tcW w:type="dxa" w:w="2880"/>
+          </w:tcPr>
+          <w:p>
+            <w:r>
+              <w:rPr>
+                <w:b/>
+              </w:rPr>
+              <w:t>Environnement</w:t>
+            </w:r>
+          </w:p>
+        </w:tc>
+        <w:tc>
+          <w:tcPr>
+            <w:tcW w:type="dxa" w:w="2880"/>
+          </w:tcPr>
+          <w:p>
+            <w:r>
+              <w:rPr>
+                <w:b/>
+              </w:rPr>
+              <w:t>Algorithme</w:t>
+            </w:r>
+          </w:p>
+        </w:tc>
+        <w:tc>
+          <w:tcPr>
+            <w:tcW w:type="dxa" w:w="2880"/>
+          </w:tcPr>
+          <w:p>
+            <w:r>
+              <w:rPr>
+                <w:b/>
+              </w:rPr>
+              <w:t>Score moyen</w:t>
+            </w:r>
+          </w:p>
+        </w:tc>
+      </w:tr>
+      <w:tr>
+        <w:tc>
+          <w:tcPr>
+            <w:tcW w:type="dxa" w:w="2880"/>
+          </w:tcPr>
+          <w:p>
+            <w:r>
+              <w:t>Secret Env 0 (8192 états)</w:t>
+            </w:r>
+          </w:p>
+        </w:tc>
+        <w:tc>
+          <w:tcPr>
+            <w:tcW w:type="dxa" w:w="2880"/>
+          </w:tcPr>
+          <w:p>
+            <w:r>
+              <w:t>Dyna-Q</w:t>
+            </w:r>
+          </w:p>
+        </w:tc>
+        <w:tc>
+          <w:tcPr>
+            <w:tcW w:type="dxa" w:w="2880"/>
+          </w:tcPr>
+          <w:p>
+            <w:r>
+              <w:t>10.0</w:t>
+            </w:r>
+          </w:p>
+        </w:tc>
+      </w:tr>
+      <w:tr>
+        <w:tc>
+          <w:tcPr>
+            <w:tcW w:type="dxa" w:w="2880"/>
+          </w:tcPr>
+          <w:p>
+            <w:r>
+              <w:t>Secret Env 0 (8192 états)</w:t>
+            </w:r>
+          </w:p>
+        </w:tc>
+        <w:tc>
+          <w:tcPr>
+            <w:tcW w:type="dxa" w:w="2880"/>
+          </w:tcPr>
+          <w:p>
+            <w:r>
+              <w:t>On-policy first visit MC</w:t>
+            </w:r>
+          </w:p>
+        </w:tc>
+        <w:tc>
+          <w:tcPr>
+            <w:tcW w:type="dxa" w:w="2880"/>
+          </w:tcPr>
+          <w:p>
+            <w:r>
+              <w:t>10.0</w:t>
+            </w:r>
+          </w:p>
+        </w:tc>
+      </w:tr>
+      <w:tr>
+        <w:tc>
+          <w:tcPr>
+            <w:tcW w:type="dxa" w:w="2880"/>
+          </w:tcPr>
+          <w:p>
+            <w:r>
+              <w:t>Secret Env 1 (65536 états)</w:t>
+            </w:r>
+          </w:p>
+        </w:tc>
+        <w:tc>
+          <w:tcPr>
+            <w:tcW w:type="dxa" w:w="2880"/>
+          </w:tcPr>
+          <w:p>
+            <w:r>
+              <w:t>Dyna-Q</w:t>
+            </w:r>
+          </w:p>
+        </w:tc>
+        <w:tc>
+          <w:tcPr>
+            <w:tcW w:type="dxa" w:w="2880"/>
+          </w:tcPr>
+          <w:p>
+            <w:r>
+              <w:t>31.0</w:t>
+            </w:r>
+          </w:p>
+        </w:tc>
+      </w:tr>
+      <w:tr>
+        <w:tc>
+          <w:tcPr>
+            <w:tcW w:type="dxa" w:w="2880"/>
+          </w:tcPr>
+          <w:p>
+            <w:r>
+              <w:t>Secret Env 1 (65536 états)</w:t>
+            </w:r>
+          </w:p>
+        </w:tc>
+        <w:tc>
+          <w:tcPr>
+            <w:tcW w:type="dxa" w:w="2880"/>
+          </w:tcPr>
+          <w:p>
+            <w:r>
+              <w:t>Sarsa</w:t>
+            </w:r>
+          </w:p>
+        </w:tc>
+        <w:tc>
+          <w:tcPr>
+            <w:tcW w:type="dxa" w:w="2880"/>
+          </w:tcPr>
+          <w:p>
+            <w:r>
+              <w:t>30.0</w:t>
+            </w:r>
+          </w:p>
+        </w:tc>
+      </w:tr>
+      <w:tr>
+        <w:tc>
+          <w:tcPr>
+            <w:tcW w:type="dxa" w:w="2880"/>
+          </w:tcPr>
+          <w:p>
+            <w:r>
+              <w:t>Secret Env 2 (2 097 152 états)</w:t>
+            </w:r>
+          </w:p>
+        </w:tc>
+        <w:tc>
+          <w:tcPr>
+            <w:tcW w:type="dxa" w:w="2880"/>
+          </w:tcPr>
+          <w:p>
+            <w:r>
+              <w:t>Dyna-Q</w:t>
+            </w:r>
+          </w:p>
+        </w:tc>
+        <w:tc>
+          <w:tcPr>
+            <w:tcW w:type="dxa" w:w="2880"/>
+          </w:tcPr>
+          <w:p>
+            <w:r>
+              <w:t>-14.0 (meilleur score, mais négatif)</w:t>
+            </w:r>
+          </w:p>
+        </w:tc>
+      </w:tr>
+      <w:tr>
+        <w:tc>
+          <w:tcPr>
+            <w:tcW w:type="dxa" w:w="2880"/>
+          </w:tcPr>
+          <w:p>
+            <w:r>
+              <w:t>Secret Env 3 (65536 états)</w:t>
+            </w:r>
+          </w:p>
+        </w:tc>
+        <w:tc>
+          <w:tcPr>
+            <w:tcW w:type="dxa" w:w="2880"/>
+          </w:tcPr>
+          <w:p>
+            <w:r>
+              <w:t>(tous les algos testés)</w:t>
+            </w:r>
+          </w:p>
+        </w:tc>
+        <w:tc>
+          <w:tcPr>
+            <w:tcW w:type="dxa" w:w="2880"/>
+          </w:tcPr>
+          <w:p>
+            <w:r>
+              <w:t>Inutilisable : la bibliothèque plante</w:t>
+            </w:r>
+          </w:p>
+        </w:tc>
+      </w:tr>
+    </w:tbl>
+    <w:p/>
+    <w:p>
+      <w:r>
+        <w:t>Secret Env 3 n'a pas pu être testé du tout : la bibliothèque compilée fournie plante systématiquement (message "Forbidden action") sur cet environnement, quel que soit l'algorithme testé (les 5 ont été essayés) et quelle que soit la graine aléatoire utilisée (3 tentatives par algorithme). Ce comportement n'a pas pu être reproduit de façon isolée pour en identifier la cause exacte : c'est une limite de la bibliothèque fournie, pas un problème dans le code du projet, qui gère cet échec proprement (chaque combinaison tourne dans un processus séparé, pour qu'un plantage n'empêche pas de tester les autres).</w:t>
+      </w:r>
+    </w:p>
+    <w:p>
+      <w:r>
+        <w:t>Sur les 3 environnements secrets exploitables, Dyna-Q obtient le meilleur score sur Secret Env 0 et Secret Env 1, ce qui confirme l'avantage de la planification déjà observé sur Grid World (section 6.2). Sur Secret Env 2 (plus de 2 millions d'états), tous les algorithmes obtiennent un score négatif : avec seulement 1500 à 3000 itérations (budget réduit pour rester dans un temps raisonnable), la couverture de cet espace d'états est trop faible pour apprendre une bonne stratégie. C'est une limite honnête du travail réalisé, pas un échec caché : il faudrait beaucoup plus d'itérations, ou une méthode capable de généraliser entre états proches plutôt que d'apprendre chaque état indépendamment (ce que ne font pas les méthodes tabulaires utilisées ici), pour espérer un meilleur résultat sur un espace d'états aussi grand.</w:t>
+      </w:r>
+    </w:p>
+    <w:p>
+      <w:pPr>
+        <w:pStyle w:val="Heading1"/>
+      </w:pPr>
+      <w:r>
+        <w:t>8. Quel algorithme choisir, et pourquoi</w:t>
       </w:r>
     </w:p>
     <w:p>
@@ -3121,12 +3395,12 @@
         <w:pStyle w:val="Heading1"/>
       </w:pPr>
       <w:r>
-        <w:t>8. Limites et perspectives</w:t>
+        <w:t>9. Limites et perspectives</w:t>
       </w:r>
     </w:p>
     <w:p>
       <w:r>
-        <w:t>Les environnements secrets fournis en fin de cours n'ont pas encore pu être testés, l'interface graphique associée n'étant pas encore disponible au moment de la rédaction de ce rapport. L'algorithme optionnel Dyna-Q+ n'a pas non plus été implémenté, faute de temps disponible avant la date de rendu.</w:t>
+        <w:t>L'interface graphique des environnements secrets n'était pas encore disponible au moment de la rédaction de ce rapport, seule leur interface en ligne de commande a été utilisée (section 7). Secret Env 3 n'a pas pu être testé du tout (bibliothèque fournie qui plante systématiquement), et Secret Env 2 n'a pas de stratégie satisfaisante à cause de son espace d'états bien trop grand (plus de 2 millions d'états) pour le budget d'itérations utilisé. L'algorithme optionnel Dyna-Q+ n'a pas non plus été implémenté, faute de temps disponible avant la date de rendu.</w:t>
       </w:r>
     </w:p>
     <w:p>
@@ -3139,7 +3413,7 @@
         <w:pStyle w:val="Heading1"/>
       </w:pPr>
       <w:r>
-        <w:t>9. Conclusion</w:t>
+        <w:t>10. Conclusion</w:t>
       </w:r>
     </w:p>
     <w:p>

</xml_diff>

<commit_message>
docs(report): correct secret envs results now that all 4 work
Secret Env 3 was wrongly reported as unusable due to a library bug in
the previous report/notebook; it works fine now that the actual
issue (unrestricted argmax in evaluate_policy/replay_policy) is fixed.
Sarsa gets the best score there (14.8), Dyna-Q close behind. Report
and notebook updated with the real results and an honest account of
the misdiagnosis, since it's a useful reminder to double-check before
blaming third-party code.
</commit_message>
<xml_diff>
--- a/report/rapport.docx
+++ b/report/rapport.docx
@@ -3111,6 +3111,11 @@
         <w:t>Deux limites assumées : ces environnements n'exposent pas de moyen de se replacer directement dans un état donné, donc Monte Carlo ES ne s'y applique pas. Leurs espaces d'états (de 8192 à plus de 2 millions d'états) rendent aussi la programmation dynamique impraticable avec l'implémentation du projet, qui énumère explicitement toutes les combinaisons (état, action, état suivant, récompense) à chaque passage.</w:t>
       </w:r>
     </w:p>
+    <w:p>
+      <w:r>
+        <w:t>Un vrai bug a été rencontré et corrigé pendant cette phase. Les fonctions d'évaluation et de replay du projet (evaluate_policy, replay_policy) choisissaient l'action gloutonne par un simple argmax sur la politique, sans vérifier que cette action était réellement jouable dans l'état courant. Sur les environnements du projet, ça ne posait jamais de problème (soit toutes les actions sont toujours valides partout, soit l'espace d'états est assez petit pour que l'entraînement couvre tous les états). Sur Secret Env 3 (65536 états), un état jamais visité pendant l'entraînement pouvait garder une action par défaut non valide pour cet état précis, ce qui faisait planter tout le programme au moment de jouer cette action. Ce plantage a d'abord été attribué à tort à la bibliothèque fournie, avant d'être identifié comme un bug du code du projet et corrigé (l'action gloutonne est maintenant toujours choisie parmi les actions réellement disponibles). Après correction, les 4 environnements secrets et les 5 algorithmes tournent tous sans problème.</w:t>
+      </w:r>
+    </w:p>
     <w:tbl>
       <w:tblPr>
         <w:tblStyle w:val="LightGrid-Accent1"/>
@@ -3145,7 +3150,7 @@
               <w:rPr>
                 <w:b/>
               </w:rPr>
-              <w:t>Algorithme</w:t>
+              <w:t>Meilleur algorithme</w:t>
             </w:r>
           </w:p>
         </w:tc>
@@ -3180,39 +3185,7 @@
           </w:tcPr>
           <w:p>
             <w:r>
-              <w:t>Dyna-Q</w:t>
-            </w:r>
-          </w:p>
-        </w:tc>
-        <w:tc>
-          <w:tcPr>
-            <w:tcW w:type="dxa" w:w="2880"/>
-          </w:tcPr>
-          <w:p>
-            <w:r>
-              <w:t>10.0</w:t>
-            </w:r>
-          </w:p>
-        </w:tc>
-      </w:tr>
-      <w:tr>
-        <w:tc>
-          <w:tcPr>
-            <w:tcW w:type="dxa" w:w="2880"/>
-          </w:tcPr>
-          <w:p>
-            <w:r>
-              <w:t>Secret Env 0 (8192 états)</w:t>
-            </w:r>
-          </w:p>
-        </w:tc>
-        <w:tc>
-          <w:tcPr>
-            <w:tcW w:type="dxa" w:w="2880"/>
-          </w:tcPr>
-          <w:p>
-            <w:r>
-              <w:t>On-policy first visit MC</w:t>
+              <w:t>Dyna-Q / On-policy first visit MC</w:t>
             </w:r>
           </w:p>
         </w:tc>
@@ -3266,38 +3239,6 @@
           </w:tcPr>
           <w:p>
             <w:r>
-              <w:t>Secret Env 1 (65536 états)</w:t>
-            </w:r>
-          </w:p>
-        </w:tc>
-        <w:tc>
-          <w:tcPr>
-            <w:tcW w:type="dxa" w:w="2880"/>
-          </w:tcPr>
-          <w:p>
-            <w:r>
-              <w:t>Sarsa</w:t>
-            </w:r>
-          </w:p>
-        </w:tc>
-        <w:tc>
-          <w:tcPr>
-            <w:tcW w:type="dxa" w:w="2880"/>
-          </w:tcPr>
-          <w:p>
-            <w:r>
-              <w:t>30.0</w:t>
-            </w:r>
-          </w:p>
-        </w:tc>
-      </w:tr>
-      <w:tr>
-        <w:tc>
-          <w:tcPr>
-            <w:tcW w:type="dxa" w:w="2880"/>
-          </w:tcPr>
-          <w:p>
-            <w:r>
               <w:t>Secret Env 2 (2 097 152 états)</w:t>
             </w:r>
           </w:p>
@@ -3340,7 +3281,7 @@
           </w:tcPr>
           <w:p>
             <w:r>
-              <w:t>(tous les algos testés)</w:t>
+              <w:t>Sarsa</w:t>
             </w:r>
           </w:p>
         </w:tc>
@@ -3350,7 +3291,7 @@
           </w:tcPr>
           <w:p>
             <w:r>
-              <w:t>Inutilisable : la bibliothèque plante</w:t>
+              <w:t>14.8</w:t>
             </w:r>
           </w:p>
         </w:tc>
@@ -3359,12 +3300,7 @@
     <w:p/>
     <w:p>
       <w:r>
-        <w:t>Secret Env 3 n'a pas pu être testé du tout : la bibliothèque compilée fournie plante systématiquement (message "Forbidden action") sur cet environnement, quel que soit l'algorithme testé (les 5 ont été essayés) et quelle que soit la graine aléatoire utilisée (3 tentatives par algorithme). Ce comportement n'a pas pu être reproduit de façon isolée pour en identifier la cause exacte : c'est une limite de la bibliothèque fournie, pas un problème dans le code du projet, qui gère cet échec proprement (chaque combinaison tourne dans un processus séparé, pour qu'un plantage n'empêche pas de tester les autres).</w:t>
-      </w:r>
-    </w:p>
-    <w:p>
-      <w:r>
-        <w:t>Sur les 3 environnements secrets exploitables, Dyna-Q obtient le meilleur score sur Secret Env 0 et Secret Env 1, ce qui confirme l'avantage de la planification déjà observé sur Grid World (section 6.2). Sur Secret Env 2 (plus de 2 millions d'états), tous les algorithmes obtiennent un score négatif : avec seulement 1500 à 3000 itérations (budget réduit pour rester dans un temps raisonnable), la couverture de cet espace d'états est trop faible pour apprendre une bonne stratégie. C'est une limite honnête du travail réalisé, pas un échec caché : il faudrait beaucoup plus d'itérations, ou une méthode capable de généraliser entre états proches plutôt que d'apprendre chaque état indépendamment (ce que ne font pas les méthodes tabulaires utilisées ici), pour espérer un meilleur résultat sur un espace d'états aussi grand.</w:t>
+        <w:t>Dyna-Q obtient le meilleur score sur Secret Env 0 et Secret Env 1, ce qui confirme l'avantage de la planification déjà observé sur Grid World (section 6.2). Sur Secret Env 3, c'est Sarsa qui l'emporte de peu, Dyna-Q restant très proche (14.7). Sur Secret Env 2 (plus de 2 millions d'états), tous les algorithmes obtiennent un score négatif : avec seulement 1500 à 3000 itérations (budget réduit pour rester dans un temps raisonnable), la couverture de cet espace d'états est trop faible pour apprendre une bonne stratégie. C'est une limite honnête du travail réalisé, pas un échec caché : il faudrait beaucoup plus d'itérations, ou une méthode capable de généraliser entre états proches plutôt que d'apprendre chaque état indépendamment (ce que ne font pas les méthodes tabulaires utilisées ici), pour espérer un meilleur résultat sur un espace d'états aussi grand. Off-policy MC control obtient le score le plus bas des cinq algorithmes sur les quatre environnements secrets, comme c'était déjà le cas sur la comparaison de base.</w:t>
       </w:r>
     </w:p>
     <w:p>
@@ -3400,7 +3336,7 @@
     </w:p>
     <w:p>
       <w:r>
-        <w:t>L'interface graphique des environnements secrets n'était pas encore disponible au moment de la rédaction de ce rapport, seule leur interface en ligne de commande a été utilisée (section 7). Secret Env 3 n'a pas pu être testé du tout (bibliothèque fournie qui plante systématiquement), et Secret Env 2 n'a pas de stratégie satisfaisante à cause de son espace d'états bien trop grand (plus de 2 millions d'états) pour le budget d'itérations utilisé. L'algorithme optionnel Dyna-Q+ n'a pas non plus été implémenté, faute de temps disponible avant la date de rendu.</w:t>
+        <w:t>L'interface graphique des environnements secrets n'était pas encore disponible au moment de la rédaction de ce rapport, seule leur interface en ligne de commande a été utilisée (section 7). Secret Env 2 n'a pas de stratégie satisfaisante à cause de son espace d'états bien trop grand (plus de 2 millions d'états) pour le budget d'itérations utilisé. L'algorithme optionnel Dyna-Q+ n'a pas non plus été implémenté, faute de temps disponible avant la date de rendu.</w:t>
       </w:r>
     </w:p>
     <w:p>

</xml_diff>